<commit_message>
update progress report with clean formulas and real output figures
</commit_message>
<xml_diff>
--- a/Micro_Project_Progress_Report_Final.docx
+++ b/Micro_Project_Progress_Report_Final.docx
@@ -34,7 +34,7 @@
     </w:p>
     <w:p>
       <w:pPr>
-        <w:spacing w:before="160" w:after="240"/>
+        <w:spacing w:before="160" w:after="280"/>
         <w:jc w:val="center"/>
       </w:pPr>
       <w:r>
@@ -53,20 +53,20 @@
         <w:tblLook w:firstColumn="1" w:firstRow="1" w:lastColumn="0" w:lastRow="0" w:noHBand="0" w:noVBand="1" w:val="04A0"/>
       </w:tblPr>
       <w:tblGrid>
-        <w:gridCol w:w="3360"/>
-        <w:gridCol w:w="3360"/>
-        <w:gridCol w:w="3360"/>
+        <w:gridCol w:w="3408"/>
+        <w:gridCol w:w="3408"/>
+        <w:gridCol w:w="3408"/>
       </w:tblGrid>
       <w:tr>
         <w:tc>
           <w:tcPr>
             <w:tcW w:type="dxa" w:w="1440"/>
-            <w:shd w:fill="E9F2FB"/>
+            <w:shd w:fill="EBF2FA"/>
             <w:tcMar>
-              <w:top w:w="120" w:type="dxa"/>
-              <w:bottom w:w="120" w:type="dxa"/>
-              <w:left w:w="150" w:type="dxa"/>
-              <w:right w:w="150" w:type="dxa"/>
+              <w:top w:w="100" w:type="dxa"/>
+              <w:bottom w:w="100" w:type="dxa"/>
+              <w:left w:w="140" w:type="dxa"/>
+              <w:right w:w="140" w:type="dxa"/>
             </w:tcMar>
           </w:tcPr>
           <w:p>
@@ -84,13 +84,13 @@
         </w:tc>
         <w:tc>
           <w:tcPr>
-            <w:tcW w:type="dxa" w:w="4608"/>
-            <w:shd w:fill="E9F2FB"/>
+            <w:tcW w:type="dxa" w:w="4896"/>
+            <w:shd w:fill="EBF2FA"/>
             <w:tcMar>
-              <w:top w:w="120" w:type="dxa"/>
-              <w:bottom w:w="120" w:type="dxa"/>
-              <w:left w:w="150" w:type="dxa"/>
-              <w:right w:w="150" w:type="dxa"/>
+              <w:top w:w="100" w:type="dxa"/>
+              <w:bottom w:w="100" w:type="dxa"/>
+              <w:left w:w="140" w:type="dxa"/>
+              <w:right w:w="140" w:type="dxa"/>
             </w:tcMar>
           </w:tcPr>
           <w:p>
@@ -108,13 +108,13 @@
         </w:tc>
         <w:tc>
           <w:tcPr>
-            <w:tcW w:type="dxa" w:w="3600"/>
-            <w:shd w:fill="E9F2FB"/>
+            <w:tcW w:type="dxa" w:w="3888"/>
+            <w:shd w:fill="EBF2FA"/>
             <w:tcMar>
-              <w:top w:w="120" w:type="dxa"/>
-              <w:bottom w:w="120" w:type="dxa"/>
-              <w:left w:w="150" w:type="dxa"/>
-              <w:right w:w="150" w:type="dxa"/>
+              <w:top w:w="100" w:type="dxa"/>
+              <w:bottom w:w="100" w:type="dxa"/>
+              <w:left w:w="140" w:type="dxa"/>
+              <w:right w:w="140" w:type="dxa"/>
             </w:tcMar>
           </w:tcPr>
           <w:p>
@@ -136,10 +136,10 @@
           <w:tcPr>
             <w:tcW w:type="dxa" w:w="1440"/>
             <w:tcMar>
-              <w:top w:w="100" w:type="dxa"/>
-              <w:bottom w:w="100" w:type="dxa"/>
-              <w:left w:w="150" w:type="dxa"/>
-              <w:right w:w="150" w:type="dxa"/>
+              <w:top w:w="90" w:type="dxa"/>
+              <w:bottom w:w="90" w:type="dxa"/>
+              <w:left w:w="140" w:type="dxa"/>
+              <w:right w:w="140" w:type="dxa"/>
             </w:tcMar>
           </w:tcPr>
           <w:p>
@@ -153,12 +153,12 @@
         </w:tc>
         <w:tc>
           <w:tcPr>
-            <w:tcW w:type="dxa" w:w="4608"/>
+            <w:tcW w:type="dxa" w:w="4896"/>
             <w:tcMar>
-              <w:top w:w="100" w:type="dxa"/>
-              <w:bottom w:w="100" w:type="dxa"/>
-              <w:left w:w="150" w:type="dxa"/>
-              <w:right w:w="150" w:type="dxa"/>
+              <w:top w:w="90" w:type="dxa"/>
+              <w:bottom w:w="90" w:type="dxa"/>
+              <w:left w:w="140" w:type="dxa"/>
+              <w:right w:w="140" w:type="dxa"/>
             </w:tcMar>
           </w:tcPr>
           <w:p>
@@ -172,12 +172,12 @@
         </w:tc>
         <w:tc>
           <w:tcPr>
-            <w:tcW w:type="dxa" w:w="3600"/>
+            <w:tcW w:type="dxa" w:w="3888"/>
             <w:tcMar>
-              <w:top w:w="100" w:type="dxa"/>
-              <w:bottom w:w="100" w:type="dxa"/>
-              <w:left w:w="150" w:type="dxa"/>
-              <w:right w:w="150" w:type="dxa"/>
+              <w:top w:w="90" w:type="dxa"/>
+              <w:bottom w:w="90" w:type="dxa"/>
+              <w:left w:w="140" w:type="dxa"/>
+              <w:right w:w="140" w:type="dxa"/>
             </w:tcMar>
           </w:tcPr>
           <w:p>
@@ -195,10 +195,10 @@
           <w:tcPr>
             <w:tcW w:type="dxa" w:w="1440"/>
             <w:tcMar>
-              <w:top w:w="100" w:type="dxa"/>
-              <w:bottom w:w="100" w:type="dxa"/>
-              <w:left w:w="150" w:type="dxa"/>
-              <w:right w:w="150" w:type="dxa"/>
+              <w:top w:w="90" w:type="dxa"/>
+              <w:bottom w:w="90" w:type="dxa"/>
+              <w:left w:w="140" w:type="dxa"/>
+              <w:right w:w="140" w:type="dxa"/>
             </w:tcMar>
           </w:tcPr>
           <w:p>
@@ -212,12 +212,12 @@
         </w:tc>
         <w:tc>
           <w:tcPr>
-            <w:tcW w:type="dxa" w:w="4608"/>
+            <w:tcW w:type="dxa" w:w="4896"/>
             <w:tcMar>
-              <w:top w:w="100" w:type="dxa"/>
-              <w:bottom w:w="100" w:type="dxa"/>
-              <w:left w:w="150" w:type="dxa"/>
-              <w:right w:w="150" w:type="dxa"/>
+              <w:top w:w="90" w:type="dxa"/>
+              <w:bottom w:w="90" w:type="dxa"/>
+              <w:left w:w="140" w:type="dxa"/>
+              <w:right w:w="140" w:type="dxa"/>
             </w:tcMar>
           </w:tcPr>
           <w:p>
@@ -231,12 +231,12 @@
         </w:tc>
         <w:tc>
           <w:tcPr>
-            <w:tcW w:type="dxa" w:w="3600"/>
+            <w:tcW w:type="dxa" w:w="3888"/>
             <w:tcMar>
-              <w:top w:w="100" w:type="dxa"/>
-              <w:bottom w:w="100" w:type="dxa"/>
-              <w:left w:w="150" w:type="dxa"/>
-              <w:right w:w="150" w:type="dxa"/>
+              <w:top w:w="90" w:type="dxa"/>
+              <w:bottom w:w="90" w:type="dxa"/>
+              <w:left w:w="140" w:type="dxa"/>
+              <w:right w:w="140" w:type="dxa"/>
             </w:tcMar>
           </w:tcPr>
           <w:p>
@@ -254,10 +254,10 @@
           <w:tcPr>
             <w:tcW w:type="dxa" w:w="1440"/>
             <w:tcMar>
-              <w:top w:w="100" w:type="dxa"/>
-              <w:bottom w:w="100" w:type="dxa"/>
-              <w:left w:w="150" w:type="dxa"/>
-              <w:right w:w="150" w:type="dxa"/>
+              <w:top w:w="90" w:type="dxa"/>
+              <w:bottom w:w="90" w:type="dxa"/>
+              <w:left w:w="140" w:type="dxa"/>
+              <w:right w:w="140" w:type="dxa"/>
             </w:tcMar>
           </w:tcPr>
           <w:p>
@@ -271,12 +271,12 @@
         </w:tc>
         <w:tc>
           <w:tcPr>
-            <w:tcW w:type="dxa" w:w="4608"/>
+            <w:tcW w:type="dxa" w:w="4896"/>
             <w:tcMar>
-              <w:top w:w="100" w:type="dxa"/>
-              <w:bottom w:w="100" w:type="dxa"/>
-              <w:left w:w="150" w:type="dxa"/>
-              <w:right w:w="150" w:type="dxa"/>
+              <w:top w:w="90" w:type="dxa"/>
+              <w:bottom w:w="90" w:type="dxa"/>
+              <w:left w:w="140" w:type="dxa"/>
+              <w:right w:w="140" w:type="dxa"/>
             </w:tcMar>
           </w:tcPr>
           <w:p>
@@ -290,12 +290,12 @@
         </w:tc>
         <w:tc>
           <w:tcPr>
-            <w:tcW w:type="dxa" w:w="3600"/>
+            <w:tcW w:type="dxa" w:w="3888"/>
             <w:tcMar>
-              <w:top w:w="100" w:type="dxa"/>
-              <w:bottom w:w="100" w:type="dxa"/>
-              <w:left w:w="150" w:type="dxa"/>
-              <w:right w:w="150" w:type="dxa"/>
+              <w:top w:w="90" w:type="dxa"/>
+              <w:bottom w:w="90" w:type="dxa"/>
+              <w:left w:w="140" w:type="dxa"/>
+              <w:right w:w="140" w:type="dxa"/>
             </w:tcMar>
           </w:tcPr>
           <w:p>
@@ -311,7 +311,7 @@
     </w:tbl>
     <w:p>
       <w:pPr>
-        <w:spacing w:before="400" w:after="120"/>
+        <w:spacing w:before="440" w:after="160"/>
         <w:jc w:val="center"/>
       </w:pPr>
       <w:r>
@@ -330,20 +330,20 @@
         <w:tblLook w:firstColumn="1" w:firstRow="1" w:lastColumn="0" w:lastRow="0" w:noHBand="0" w:noVBand="1" w:val="04A0"/>
       </w:tblPr>
       <w:tblGrid>
-        <w:gridCol w:w="2016"/>
-        <w:gridCol w:w="2016"/>
-        <w:gridCol w:w="2016"/>
-        <w:gridCol w:w="2016"/>
-        <w:gridCol w:w="2016"/>
+        <w:gridCol w:w="2045"/>
+        <w:gridCol w:w="2045"/>
+        <w:gridCol w:w="2045"/>
+        <w:gridCol w:w="2045"/>
+        <w:gridCol w:w="2045"/>
       </w:tblGrid>
       <w:tr>
         <w:tc>
           <w:tcPr>
-            <w:tcW w:type="dxa" w:w="1584"/>
-            <w:shd w:fill="E9F2FB"/>
+            <w:tcW w:type="dxa" w:w="1728"/>
+            <w:shd w:fill="EBF2FA"/>
             <w:tcMar>
-              <w:top w:w="120" w:type="dxa"/>
-              <w:bottom w:w="120" w:type="dxa"/>
+              <w:top w:w="100" w:type="dxa"/>
+              <w:bottom w:w="100" w:type="dxa"/>
               <w:left w:w="100" w:type="dxa"/>
               <w:right w:w="100" w:type="dxa"/>
             </w:tcMar>
@@ -363,11 +363,11 @@
         </w:tc>
         <w:tc>
           <w:tcPr>
-            <w:tcW w:type="dxa" w:w="2592"/>
-            <w:shd w:fill="E9F2FB"/>
+            <w:tcW w:type="dxa" w:w="2736"/>
+            <w:shd w:fill="EBF2FA"/>
             <w:tcMar>
-              <w:top w:w="120" w:type="dxa"/>
-              <w:bottom w:w="120" w:type="dxa"/>
+              <w:top w:w="100" w:type="dxa"/>
+              <w:bottom w:w="100" w:type="dxa"/>
               <w:left w:w="100" w:type="dxa"/>
               <w:right w:w="100" w:type="dxa"/>
             </w:tcMar>
@@ -388,10 +388,10 @@
         <w:tc>
           <w:tcPr>
             <w:tcW w:type="dxa" w:w="1872"/>
-            <w:shd w:fill="E9F2FB"/>
+            <w:shd w:fill="EBF2FA"/>
             <w:tcMar>
-              <w:top w:w="120" w:type="dxa"/>
-              <w:bottom w:w="120" w:type="dxa"/>
+              <w:top w:w="100" w:type="dxa"/>
+              <w:bottom w:w="100" w:type="dxa"/>
               <w:left w:w="100" w:type="dxa"/>
               <w:right w:w="100" w:type="dxa"/>
             </w:tcMar>
@@ -411,11 +411,11 @@
         </w:tc>
         <w:tc>
           <w:tcPr>
-            <w:tcW w:type="dxa" w:w="2304"/>
-            <w:shd w:fill="E9F2FB"/>
+            <w:tcW w:type="dxa" w:w="2592"/>
+            <w:shd w:fill="EBF2FA"/>
             <w:tcMar>
-              <w:top w:w="120" w:type="dxa"/>
-              <w:bottom w:w="120" w:type="dxa"/>
+              <w:top w:w="100" w:type="dxa"/>
+              <w:bottom w:w="100" w:type="dxa"/>
               <w:left w:w="100" w:type="dxa"/>
               <w:right w:w="100" w:type="dxa"/>
             </w:tcMar>
@@ -436,10 +436,10 @@
         <w:tc>
           <w:tcPr>
             <w:tcW w:type="dxa" w:w="1296"/>
-            <w:shd w:fill="E9F2FB"/>
+            <w:shd w:fill="EBF2FA"/>
             <w:tcMar>
-              <w:top w:w="120" w:type="dxa"/>
-              <w:bottom w:w="120" w:type="dxa"/>
+              <w:top w:w="100" w:type="dxa"/>
+              <w:bottom w:w="100" w:type="dxa"/>
               <w:left w:w="100" w:type="dxa"/>
               <w:right w:w="100" w:type="dxa"/>
             </w:tcMar>
@@ -461,10 +461,10 @@
       <w:tr>
         <w:tc>
           <w:tcPr>
-            <w:tcW w:type="dxa" w:w="1584"/>
+            <w:tcW w:type="dxa" w:w="1728"/>
             <w:tcMar>
-              <w:top w:w="150" w:type="dxa"/>
-              <w:bottom w:w="150" w:type="dxa"/>
+              <w:top w:w="140" w:type="dxa"/>
+              <w:bottom w:w="140" w:type="dxa"/>
               <w:left w:w="100" w:type="dxa"/>
               <w:right w:w="100" w:type="dxa"/>
             </w:tcMar>
@@ -483,10 +483,10 @@
         </w:tc>
         <w:tc>
           <w:tcPr>
-            <w:tcW w:type="dxa" w:w="2592"/>
+            <w:tcW w:type="dxa" w:w="2736"/>
             <w:tcMar>
-              <w:top w:w="150" w:type="dxa"/>
-              <w:bottom w:w="150" w:type="dxa"/>
+              <w:top w:w="140" w:type="dxa"/>
+              <w:bottom w:w="140" w:type="dxa"/>
               <w:left w:w="100" w:type="dxa"/>
               <w:right w:w="100" w:type="dxa"/>
             </w:tcMar>
@@ -504,8 +504,8 @@
           <w:tcPr>
             <w:tcW w:type="dxa" w:w="1872"/>
             <w:tcMar>
-              <w:top w:w="150" w:type="dxa"/>
-              <w:bottom w:w="150" w:type="dxa"/>
+              <w:top w:w="140" w:type="dxa"/>
+              <w:bottom w:w="140" w:type="dxa"/>
               <w:left w:w="100" w:type="dxa"/>
               <w:right w:w="100" w:type="dxa"/>
             </w:tcMar>
@@ -514,10 +514,10 @@
         </w:tc>
         <w:tc>
           <w:tcPr>
-            <w:tcW w:type="dxa" w:w="2304"/>
+            <w:tcW w:type="dxa" w:w="2592"/>
             <w:tcMar>
-              <w:top w:w="150" w:type="dxa"/>
-              <w:bottom w:w="150" w:type="dxa"/>
+              <w:top w:w="140" w:type="dxa"/>
+              <w:bottom w:w="140" w:type="dxa"/>
               <w:left w:w="100" w:type="dxa"/>
               <w:right w:w="100" w:type="dxa"/>
             </w:tcMar>
@@ -528,8 +528,8 @@
           <w:tcPr>
             <w:tcW w:type="dxa" w:w="1296"/>
             <w:tcMar>
-              <w:top w:w="150" w:type="dxa"/>
-              <w:bottom w:w="150" w:type="dxa"/>
+              <w:top w:w="140" w:type="dxa"/>
+              <w:bottom w:w="140" w:type="dxa"/>
               <w:left w:w="100" w:type="dxa"/>
               <w:right w:w="100" w:type="dxa"/>
             </w:tcMar>
@@ -540,10 +540,10 @@
       <w:tr>
         <w:tc>
           <w:tcPr>
-            <w:tcW w:type="dxa" w:w="1584"/>
+            <w:tcW w:type="dxa" w:w="1728"/>
             <w:tcMar>
-              <w:top w:w="150" w:type="dxa"/>
-              <w:bottom w:w="150" w:type="dxa"/>
+              <w:top w:w="140" w:type="dxa"/>
+              <w:bottom w:w="140" w:type="dxa"/>
               <w:left w:w="100" w:type="dxa"/>
               <w:right w:w="100" w:type="dxa"/>
             </w:tcMar>
@@ -562,10 +562,10 @@
         </w:tc>
         <w:tc>
           <w:tcPr>
-            <w:tcW w:type="dxa" w:w="2592"/>
+            <w:tcW w:type="dxa" w:w="2736"/>
             <w:tcMar>
-              <w:top w:w="150" w:type="dxa"/>
-              <w:bottom w:w="150" w:type="dxa"/>
+              <w:top w:w="140" w:type="dxa"/>
+              <w:bottom w:w="140" w:type="dxa"/>
               <w:left w:w="100" w:type="dxa"/>
               <w:right w:w="100" w:type="dxa"/>
             </w:tcMar>
@@ -583,8 +583,8 @@
           <w:tcPr>
             <w:tcW w:type="dxa" w:w="1872"/>
             <w:tcMar>
-              <w:top w:w="150" w:type="dxa"/>
-              <w:bottom w:w="150" w:type="dxa"/>
+              <w:top w:w="140" w:type="dxa"/>
+              <w:bottom w:w="140" w:type="dxa"/>
               <w:left w:w="100" w:type="dxa"/>
               <w:right w:w="100" w:type="dxa"/>
             </w:tcMar>
@@ -593,10 +593,10 @@
         </w:tc>
         <w:tc>
           <w:tcPr>
-            <w:tcW w:type="dxa" w:w="2304"/>
+            <w:tcW w:type="dxa" w:w="2592"/>
             <w:tcMar>
-              <w:top w:w="150" w:type="dxa"/>
-              <w:bottom w:w="150" w:type="dxa"/>
+              <w:top w:w="140" w:type="dxa"/>
+              <w:bottom w:w="140" w:type="dxa"/>
               <w:left w:w="100" w:type="dxa"/>
               <w:right w:w="100" w:type="dxa"/>
             </w:tcMar>
@@ -607,8 +607,8 @@
           <w:tcPr>
             <w:tcW w:type="dxa" w:w="1296"/>
             <w:tcMar>
-              <w:top w:w="150" w:type="dxa"/>
-              <w:bottom w:w="150" w:type="dxa"/>
+              <w:top w:w="140" w:type="dxa"/>
+              <w:bottom w:w="140" w:type="dxa"/>
               <w:left w:w="100" w:type="dxa"/>
               <w:right w:w="100" w:type="dxa"/>
             </w:tcMar>
@@ -619,10 +619,10 @@
       <w:tr>
         <w:tc>
           <w:tcPr>
-            <w:tcW w:type="dxa" w:w="1584"/>
+            <w:tcW w:type="dxa" w:w="1728"/>
             <w:tcMar>
-              <w:top w:w="150" w:type="dxa"/>
-              <w:bottom w:w="150" w:type="dxa"/>
+              <w:top w:w="140" w:type="dxa"/>
+              <w:bottom w:w="140" w:type="dxa"/>
               <w:left w:w="100" w:type="dxa"/>
               <w:right w:w="100" w:type="dxa"/>
             </w:tcMar>
@@ -641,10 +641,10 @@
         </w:tc>
         <w:tc>
           <w:tcPr>
-            <w:tcW w:type="dxa" w:w="2592"/>
+            <w:tcW w:type="dxa" w:w="2736"/>
             <w:tcMar>
-              <w:top w:w="150" w:type="dxa"/>
-              <w:bottom w:w="150" w:type="dxa"/>
+              <w:top w:w="140" w:type="dxa"/>
+              <w:bottom w:w="140" w:type="dxa"/>
               <w:left w:w="100" w:type="dxa"/>
               <w:right w:w="100" w:type="dxa"/>
             </w:tcMar>
@@ -662,8 +662,8 @@
           <w:tcPr>
             <w:tcW w:type="dxa" w:w="1872"/>
             <w:tcMar>
-              <w:top w:w="150" w:type="dxa"/>
-              <w:bottom w:w="150" w:type="dxa"/>
+              <w:top w:w="140" w:type="dxa"/>
+              <w:bottom w:w="140" w:type="dxa"/>
               <w:left w:w="100" w:type="dxa"/>
               <w:right w:w="100" w:type="dxa"/>
             </w:tcMar>
@@ -672,10 +672,10 @@
         </w:tc>
         <w:tc>
           <w:tcPr>
-            <w:tcW w:type="dxa" w:w="2304"/>
+            <w:tcW w:type="dxa" w:w="2592"/>
             <w:tcMar>
-              <w:top w:w="150" w:type="dxa"/>
-              <w:bottom w:w="150" w:type="dxa"/>
+              <w:top w:w="140" w:type="dxa"/>
+              <w:bottom w:w="140" w:type="dxa"/>
               <w:left w:w="100" w:type="dxa"/>
               <w:right w:w="100" w:type="dxa"/>
             </w:tcMar>
@@ -686,8 +686,8 @@
           <w:tcPr>
             <w:tcW w:type="dxa" w:w="1296"/>
             <w:tcMar>
-              <w:top w:w="150" w:type="dxa"/>
-              <w:bottom w:w="150" w:type="dxa"/>
+              <w:top w:w="140" w:type="dxa"/>
+              <w:bottom w:w="140" w:type="dxa"/>
               <w:left w:w="100" w:type="dxa"/>
               <w:right w:w="100" w:type="dxa"/>
             </w:tcMar>
@@ -703,7 +703,7 @@
     </w:p>
     <w:p>
       <w:pPr>
-        <w:spacing w:after="60"/>
+        <w:spacing w:after="40"/>
       </w:pPr>
       <w:r>
         <w:rPr>
@@ -735,7 +735,7 @@
     </w:p>
     <w:p>
       <w:pPr>
-        <w:spacing w:before="160" w:after="80"/>
+        <w:spacing w:before="120" w:after="60"/>
       </w:pPr>
       <w:r>
         <w:rPr>
@@ -747,14 +747,38 @@
     </w:p>
     <w:p>
       <w:pPr>
-        <w:spacing w:before="80" w:after="40"/>
+        <w:spacing w:before="60" w:after="20"/>
       </w:pPr>
       <w:r>
         <w:rPr>
           <w:b/>
           <w:sz w:val="19"/>
         </w:rPr>
-        <w:t>Data Preparation and Auditing:</w:t>
+        <w:t>Data Preparation and Preprocessing:</w:t>
+      </w:r>
+    </w:p>
+    <w:p>
+      <w:pPr>
+        <w:pStyle w:val="ListBullet"/>
+        <w:spacing w:after="20"/>
+      </w:pPr>
+      <w:r>
+        <w:rPr>
+          <w:sz w:val="17"/>
+        </w:rPr>
+        <w:t>Ingested the complete official ICBHI 2017 Respiratory Sound Database (~2.0 GB, 920 recordings, 6,898 extracted respiratory cycles).</w:t>
+      </w:r>
+    </w:p>
+    <w:p>
+      <w:pPr>
+        <w:pStyle w:val="ListBullet"/>
+        <w:spacing w:after="20"/>
+      </w:pPr>
+      <w:r>
+        <w:rPr>
+          <w:sz w:val="17"/>
+        </w:rPr>
+        <w:t>Enforced strict Patient-Independent GroupKFold cross-validation (5,401 train / 1,497 val) to prevent diagnostic leakage across splits.</w:t>
       </w:r>
     </w:p>
     <w:p>
@@ -766,36 +790,52 @@
         <w:rPr>
           <w:sz w:val="17"/>
         </w:rPr>
-        <w:t>Curated and integrated the complete official ICBHI 2017 Respiratory Sound Database (~2.0 GB, 920 multi-channel stethoscope recordings, 6,898 annotated respiratory cycles).</w:t>
+        <w:t>Extracted 128-band Log-Mel Spectrograms at 16 kHz (STFT window=1024, hop=512) capturing adventitious crackles and wheezes (50–8000 Hz):</w:t>
       </w:r>
     </w:p>
     <w:p>
       <w:pPr>
-        <w:pStyle w:val="ListBullet"/>
         <w:spacing w:after="40"/>
+        <w:jc w:val="center"/>
       </w:pPr>
       <w:r>
-        <w:rPr>
-          <w:sz w:val="17"/>
-        </w:rPr>
-        <w:t>Enforced strict Patient-Independent GroupKFold cross-validation (5,401 train / 1,497 val) to completely eliminate clinical data leakage across splits.</w:t>
+        <w:drawing>
+          <wp:inline xmlns:a="http://schemas.openxmlformats.org/drawingml/2006/main" xmlns:pic="http://schemas.openxmlformats.org/drawingml/2006/picture">
+            <wp:extent cx="3840480" cy="426071"/>
+            <wp:docPr id="1" name="Picture 1"/>
+            <wp:cNvGraphicFramePr>
+              <a:graphicFrameLocks noChangeAspect="1"/>
+            </wp:cNvGraphicFramePr>
+            <a:graphic>
+              <a:graphicData uri="http://schemas.openxmlformats.org/drawingml/2006/picture">
+                <pic:pic>
+                  <pic:nvPicPr>
+                    <pic:cNvPr id="0" name="eq_logmel.png"/>
+                    <pic:cNvPicPr/>
+                  </pic:nvPicPr>
+                  <pic:blipFill>
+                    <a:blip r:embed="rId9"/>
+                    <a:stretch>
+                      <a:fillRect/>
+                    </a:stretch>
+                  </pic:blipFill>
+                  <pic:spPr>
+                    <a:xfrm>
+                      <a:off x="0" y="0"/>
+                      <a:ext cx="3840480" cy="426071"/>
+                    </a:xfrm>
+                    <a:prstGeom prst="rect"/>
+                  </pic:spPr>
+                </pic:pic>
+              </a:graphicData>
+            </a:graphic>
+          </wp:inline>
+        </w:drawing>
       </w:r>
     </w:p>
     <w:p>
       <w:pPr>
-        <w:pStyle w:val="ListBullet"/>
-        <w:spacing w:after="40"/>
-      </w:pPr>
-      <w:r>
-        <w:rPr>
-          <w:sz w:val="17"/>
-        </w:rPr>
-        <w:t>Implemented standardized audio preprocessing: mono conversion, 16 kHz resampling, and 128-band Log-Mel Spectrogram extraction (STFT window=1024, hop=512) emphasizing vesicular and adventitious frequencies (50–8000 Hz):</w:t>
-      </w:r>
-    </w:p>
-    <w:p>
-      <w:pPr>
-        <w:spacing w:before="80" w:after="40"/>
+        <w:spacing w:before="60" w:after="20"/>
       </w:pPr>
       <w:r>
         <w:rPr>
@@ -808,25 +848,65 @@
     <w:p>
       <w:pPr>
         <w:pStyle w:val="ListBullet"/>
-        <w:spacing w:after="40"/>
+        <w:spacing w:after="20"/>
       </w:pPr>
       <w:r>
         <w:rPr>
           <w:sz w:val="17"/>
         </w:rPr>
-        <w:t>Engineered a 4-stage convolutional backbone with Temporal Attention Pooling, dynamically weighting salient 10–20 ms crackle transients rather than diluting bursts via uniform global pooling:</w:t>
+        <w:t>Engineered a 4-stage convolutional backbone with Temporal Attention Pooling to dynamically weight transient 10–20 ms crackle bursts:</w:t>
+      </w:r>
+    </w:p>
+    <w:p>
+      <w:pPr>
+        <w:spacing w:after="20"/>
+        <w:jc w:val="center"/>
+      </w:pPr>
+      <w:r>
+        <w:drawing>
+          <wp:inline xmlns:a="http://schemas.openxmlformats.org/drawingml/2006/main" xmlns:pic="http://schemas.openxmlformats.org/drawingml/2006/picture">
+            <wp:extent cx="2560320" cy="408086"/>
+            <wp:docPr id="2" name="Picture 2"/>
+            <wp:cNvGraphicFramePr>
+              <a:graphicFrameLocks noChangeAspect="1"/>
+            </wp:cNvGraphicFramePr>
+            <a:graphic>
+              <a:graphicData uri="http://schemas.openxmlformats.org/drawingml/2006/picture">
+                <pic:pic>
+                  <pic:nvPicPr>
+                    <pic:cNvPr id="0" name="eq_attention.png"/>
+                    <pic:cNvPicPr/>
+                  </pic:nvPicPr>
+                  <pic:blipFill>
+                    <a:blip r:embed="rId10"/>
+                    <a:stretch>
+                      <a:fillRect/>
+                    </a:stretch>
+                  </pic:blipFill>
+                  <pic:spPr>
+                    <a:xfrm>
+                      <a:off x="0" y="0"/>
+                      <a:ext cx="2560320" cy="408086"/>
+                    </a:xfrm>
+                    <a:prstGeom prst="rect"/>
+                  </pic:spPr>
+                </pic:pic>
+              </a:graphicData>
+            </a:graphic>
+          </wp:inline>
+        </w:drawing>
       </w:r>
     </w:p>
     <w:p>
       <w:pPr>
         <w:pStyle w:val="ListBullet"/>
-        <w:spacing w:after="40"/>
+        <w:spacing w:after="20"/>
       </w:pPr>
       <w:r>
         <w:rPr>
           <w:sz w:val="17"/>
         </w:rPr>
-        <w:t>Trained using SpecAugment (time &amp; frequency masking) combined with Focal Loss (gamma=2.0) weighted by inverse class frequency to handle extreme class imbalance (Normal: 54%, Crackle: 33%, Wheeze: 8%, Both: 4%):</w:t>
+        <w:t>Trained using SpecAugment and Focal Loss (gamma=2.0) with inverse frequency weighting to counteract severe class imbalance (Normal: 54%, Crackle: 33%, Wheeze: 8%, Both: 4%):</w:t>
       </w:r>
     </w:p>
     <w:p>
@@ -835,125 +915,119 @@
         <w:jc w:val="center"/>
       </w:pPr>
       <w:r>
-        <w:rPr>
-          <w:b/>
-          <w:color w:val="1E466E"/>
-          <w:sz w:val="16"/>
-        </w:rPr>
-        <w:t>FL(pt) = -alpha * (1 - pt)^gamma * log(pt),     alpha_t = Softmax(W2 * tanh(W1 * ht))</w:t>
+        <w:drawing>
+          <wp:inline xmlns:a="http://schemas.openxmlformats.org/drawingml/2006/main" xmlns:pic="http://schemas.openxmlformats.org/drawingml/2006/picture">
+            <wp:extent cx="2926080" cy="466384"/>
+            <wp:docPr id="3" name="Picture 3"/>
+            <wp:cNvGraphicFramePr>
+              <a:graphicFrameLocks noChangeAspect="1"/>
+            </wp:cNvGraphicFramePr>
+            <a:graphic>
+              <a:graphicData uri="http://schemas.openxmlformats.org/drawingml/2006/picture">
+                <pic:pic>
+                  <pic:nvPicPr>
+                    <pic:cNvPr id="0" name="eq_focal.png"/>
+                    <pic:cNvPicPr/>
+                  </pic:nvPicPr>
+                  <pic:blipFill>
+                    <a:blip r:embed="rId11"/>
+                    <a:stretch>
+                      <a:fillRect/>
+                    </a:stretch>
+                  </pic:blipFill>
+                  <pic:spPr>
+                    <a:xfrm>
+                      <a:off x="0" y="0"/>
+                      <a:ext cx="2926080" cy="466384"/>
+                    </a:xfrm>
+                    <a:prstGeom prst="rect"/>
+                  </pic:spPr>
+                </pic:pic>
+              </a:graphicData>
+            </a:graphic>
+          </wp:inline>
+        </w:drawing>
       </w:r>
     </w:p>
     <w:p>
       <w:pPr>
-        <w:spacing w:before="80" w:after="40"/>
+        <w:spacing w:before="60" w:after="20"/>
       </w:pPr>
       <w:r>
         <w:rPr>
           <w:b/>
           <w:sz w:val="19"/>
         </w:rPr>
-        <w:t>Dual Explainability (XAI) &amp; Faithfulness Verification:</w:t>
+        <w:t>Dual Explainability (XAI) &amp; Joint Reliability Index (JRI):</w:t>
       </w:r>
     </w:p>
     <w:p>
       <w:pPr>
         <w:pStyle w:val="ListBullet"/>
-        <w:spacing w:after="40"/>
+        <w:spacing w:after="20"/>
       </w:pPr>
       <w:r>
         <w:rPr>
           <w:sz w:val="17"/>
         </w:rPr>
-        <w:t>Integrated coarse spatial localization via Grad-CAM on penultimate feature activations alongside fine-grained pixel-level attributions via SHAP GradientExplainer.</w:t>
+        <w:t>Integrated dual attributions combining coarse spatial activation (Grad-CAM) with game-theoretic pixel attributions (SHAP GradientExplainer) decomposed into Low (50–500 Hz), Mid (500–2 kHz), and High (2–8 kHz) frequency bands.</w:t>
       </w:r>
     </w:p>
     <w:p>
       <w:pPr>
         <w:pStyle w:val="ListBullet"/>
-        <w:spacing w:after="40"/>
+        <w:spacing w:after="20"/>
       </w:pPr>
       <w:r>
         <w:rPr>
           <w:sz w:val="17"/>
         </w:rPr>
-        <w:t>Engineered frequency-band attribution mapping decomposing explanations into clinical bands (Low: 50–500 Hz, Mid: 500–2 kHz, High: 2–8 kHz) aligned with pulmonology diagnostic criteria.</w:t>
+        <w:t>Formulated the Joint Reliability Index as the harmonic mean of predictive robustness (R) and explanation stability (S via SSIM):</w:t>
       </w:r>
     </w:p>
     <w:p>
       <w:pPr>
-        <w:pStyle w:val="ListBullet"/>
         <w:spacing w:after="40"/>
+        <w:jc w:val="center"/>
       </w:pPr>
       <w:r>
-        <w:rPr>
-          <w:sz w:val="17"/>
-        </w:rPr>
-        <w:t>Mathematically evaluated explanation faithfulness via Insertion AUC, Deletion AUC, and Area Over Perturbation Curve (AOPC).</w:t>
+        <w:drawing>
+          <wp:inline xmlns:a="http://schemas.openxmlformats.org/drawingml/2006/main" xmlns:pic="http://schemas.openxmlformats.org/drawingml/2006/picture">
+            <wp:extent cx="3749039" cy="450131"/>
+            <wp:docPr id="4" name="Picture 4"/>
+            <wp:cNvGraphicFramePr>
+              <a:graphicFrameLocks noChangeAspect="1"/>
+            </wp:cNvGraphicFramePr>
+            <a:graphic>
+              <a:graphicData uri="http://schemas.openxmlformats.org/drawingml/2006/picture">
+                <pic:pic>
+                  <pic:nvPicPr>
+                    <pic:cNvPr id="0" name="eq_jri.png"/>
+                    <pic:cNvPicPr/>
+                  </pic:nvPicPr>
+                  <pic:blipFill>
+                    <a:blip r:embed="rId12"/>
+                    <a:stretch>
+                      <a:fillRect/>
+                    </a:stretch>
+                  </pic:blipFill>
+                  <pic:spPr>
+                    <a:xfrm>
+                      <a:off x="0" y="0"/>
+                      <a:ext cx="3749039" cy="450131"/>
+                    </a:xfrm>
+                    <a:prstGeom prst="rect"/>
+                  </pic:spPr>
+                </pic:pic>
+              </a:graphicData>
+            </a:graphic>
+          </wp:inline>
+        </w:drawing>
       </w:r>
     </w:p>
     <w:p>
       <w:pPr>
-        <w:spacing w:before="80" w:after="40"/>
-      </w:pPr>
-      <w:r>
-        <w:rPr>
-          <w:b/>
-          <w:sz w:val="19"/>
-        </w:rPr>
-        <w:t>Robustness &amp; Joint Reliability Index (JRI):</w:t>
-      </w:r>
-    </w:p>
-    <w:p>
-      <w:pPr>
-        <w:pStyle w:val="ListBullet"/>
-        <w:spacing w:after="40"/>
-      </w:pPr>
-      <w:r>
-        <w:rPr>
-          <w:sz w:val="17"/>
-        </w:rPr>
-        <w:t>Designed an automated SNR noise injection sweep (Clean down to 0 dB) and explanation structural stability scoring (SSIM).</w:t>
-      </w:r>
-    </w:p>
-    <w:p>
-      <w:pPr>
-        <w:pStyle w:val="ListBullet"/>
-        <w:spacing w:after="40"/>
-      </w:pPr>
-      <w:r>
-        <w:rPr>
-          <w:sz w:val="17"/>
-        </w:rPr>
-        <w:t>Formulated the Joint Reliability Index as the harmonic mean of predictive robustness (R) and explanation stability (S): JRI = (2 * R * S) / (R + S), penalizing decoupled models that guess correctly from noise artifacts.</w:t>
-      </w:r>
-    </w:p>
-    <w:p>
-      <w:pPr>
-        <w:spacing w:before="80" w:after="40"/>
-      </w:pPr>
-      <w:r>
-        <w:rPr>
-          <w:b/>
-          <w:sz w:val="19"/>
-        </w:rPr>
-        <w:t>Clinical Dashboard Prototype:</w:t>
-      </w:r>
-    </w:p>
-    <w:p>
-      <w:pPr>
-        <w:pStyle w:val="ListBullet"/>
-        <w:spacing w:after="40"/>
-      </w:pPr>
-      <w:r>
-        <w:rPr>
-          <w:sz w:val="17"/>
-        </w:rPr>
-        <w:t>Deployed an interactive 4-tab Streamlit diagnostic system (Audio Analysis, Dual XAI Overlays, Robustness Sweep, Model Performance) with pre-loaded weights for instant reproduction and a 104/104 passing unit test suite.</w:t>
-      </w:r>
-    </w:p>
-    <w:p>
-      <w:pPr>
-        <w:spacing w:before="160" w:after="80"/>
+        <w:spacing w:before="120" w:after="40"/>
       </w:pPr>
       <w:r>
         <w:rPr>
@@ -965,14 +1039,14 @@
     </w:p>
     <w:p>
       <w:pPr>
-        <w:spacing w:after="80"/>
+        <w:spacing w:after="0"/>
         <w:jc w:val="center"/>
       </w:pPr>
       <w:r>
         <w:drawing>
           <wp:inline xmlns:a="http://schemas.openxmlformats.org/drawingml/2006/main" xmlns:pic="http://schemas.openxmlformats.org/drawingml/2006/picture">
-            <wp:extent cx="5669280" cy="3001384"/>
-            <wp:docPr id="1" name="Picture 1"/>
+            <wp:extent cx="5303520" cy="2828544"/>
+            <wp:docPr id="5" name="Picture 5"/>
             <wp:cNvGraphicFramePr>
               <a:graphicFrameLocks noChangeAspect="1"/>
             </wp:cNvGraphicFramePr>
@@ -980,11 +1054,11 @@
               <a:graphicData uri="http://schemas.openxmlformats.org/drawingml/2006/picture">
                 <pic:pic>
                   <pic:nvPicPr>
-                    <pic:cNvPr id="0" name="progress_timeline.png"/>
+                    <pic:cNvPr id="0" name="progress_timeline_clean.png"/>
                     <pic:cNvPicPr/>
                   </pic:nvPicPr>
                   <pic:blipFill>
-                    <a:blip r:embed="rId9"/>
+                    <a:blip r:embed="rId13"/>
                     <a:stretch>
                       <a:fillRect/>
                     </a:stretch>
@@ -992,7 +1066,7 @@
                   <pic:spPr>
                     <a:xfrm>
                       <a:off x="0" y="0"/>
-                      <a:ext cx="5669280" cy="3001384"/>
+                      <a:ext cx="5303520" cy="2828544"/>
                     </a:xfrm>
                     <a:prstGeom prst="rect"/>
                   </pic:spPr>
@@ -1010,7 +1084,7 @@
     </w:p>
     <w:p>
       <w:pPr>
-        <w:spacing w:after="60"/>
+        <w:spacing w:after="40"/>
       </w:pPr>
       <w:r>
         <w:rPr>
@@ -1022,133 +1096,145 @@
     </w:p>
     <w:p>
       <w:pPr>
-        <w:spacing w:after="80"/>
+        <w:spacing w:after="60"/>
       </w:pPr>
       <w:r>
         <w:rPr>
-          <w:sz w:val="18"/>
+          <w:sz w:val="17"/>
         </w:rPr>
-        <w:t>The next phase of the project will focus on advanced experimental validation beyond the baseline:</w:t>
+        <w:t>The next phase of the project will focus on expanding the validated baseline into advanced experimental validation:</w:t>
       </w:r>
     </w:p>
     <w:p>
       <w:pPr>
-        <w:spacing w:after="60"/>
+        <w:spacing w:after="30"/>
       </w:pPr>
       <w:r>
         <w:rPr>
           <w:b/>
-          <w:sz w:val="18"/>
+          <w:sz w:val="17"/>
         </w:rPr>
         <w:t xml:space="preserve">1. Advanced Audio Backbones — </w:t>
       </w:r>
       <w:r>
         <w:rPr>
-          <w:sz w:val="18"/>
+          <w:sz w:val="17"/>
         </w:rPr>
-        <w:t>benchmarking self-supervised foundation audio representations (AST, PaSST, PANNs CNN14) to enhance feature discrimination on underrepresented classes (Wheeze, Both).</w:t>
+        <w:t>benchmarking self-supervised foundation audio models (AST, PaSST, PANNs CNN14) to improve recall on minority classes (Wheeze &amp; Both).</w:t>
       </w:r>
     </w:p>
     <w:p>
       <w:pPr>
-        <w:spacing w:after="60"/>
+        <w:spacing w:after="30"/>
       </w:pPr>
       <w:r>
         <w:rPr>
           <w:b/>
-          <w:sz w:val="18"/>
+          <w:sz w:val="17"/>
         </w:rPr>
-        <w:t xml:space="preserve">2. Supervised Contrastive Learning (SupCon) — </w:t>
+        <w:t xml:space="preserve">2. Supervised Contrastive Learning — </w:t>
       </w:r>
       <w:r>
         <w:rPr>
-          <w:sz w:val="18"/>
+          <w:sz w:val="17"/>
         </w:rPr>
-        <w:t>incorporating contrastive loss formulations on acoustic embeddings to improve topological separation between subtle adventitious sounds and baseline respiration.</w:t>
+        <w:t>incorporating SupCon loss on acoustic embeddings to improve topological boundary separation between faint wheezes and regular breathing.</w:t>
       </w:r>
     </w:p>
     <w:p>
       <w:pPr>
-        <w:spacing w:after="60"/>
+        <w:spacing w:after="30"/>
       </w:pPr>
       <w:r>
         <w:rPr>
           <w:b/>
-          <w:sz w:val="18"/>
+          <w:sz w:val="17"/>
         </w:rPr>
         <w:t xml:space="preserve">3. Noise-Aware Multi-SNR Training — </w:t>
       </w:r>
       <w:r>
         <w:rPr>
-          <w:sz w:val="18"/>
+          <w:sz w:val="17"/>
         </w:rPr>
-        <w:t>training a systematic model grid with dynamic on-the-fly SNR injection to demonstrate measurable empirical improvements in the Joint Reliability Index (JRI).</w:t>
+        <w:t>training with dynamic on-the-fly SNR injection to demonstrate measurable empirical improvements in the Joint Reliability Index.</w:t>
       </w:r>
     </w:p>
     <w:p>
       <w:pPr>
-        <w:spacing w:after="60"/>
+        <w:spacing w:after="30"/>
       </w:pPr>
       <w:r>
         <w:rPr>
           <w:b/>
-          <w:sz w:val="18"/>
+          <w:sz w:val="17"/>
         </w:rPr>
-        <w:t xml:space="preserve">4. Real Clinical Noise Injection — </w:t>
+        <w:t xml:space="preserve">4. Hospital Acoustic Artifacts — </w:t>
       </w:r>
       <w:r>
         <w:rPr>
-          <w:sz w:val="18"/>
+          <w:sz w:val="17"/>
         </w:rPr>
-        <w:t>evaluating non-stationary hospital soundscapes (ICU monitors, digital stethoscope friction, ambient speech) from the ESC-50 and FreeSound corpora.</w:t>
+        <w:t>evaluating non-stationary hospital soundscapes (ICU monitors, stethoscope friction, ambient chatter) from the ESC-50 dataset.</w:t>
       </w:r>
     </w:p>
     <w:p>
       <w:pPr>
-        <w:spacing w:after="60"/>
+        <w:spacing w:after="30"/>
       </w:pPr>
       <w:r>
         <w:rPr>
           <w:b/>
-          <w:sz w:val="18"/>
+          <w:sz w:val="17"/>
         </w:rPr>
         <w:t xml:space="preserve">5. Cross-Corpus Generalization — </w:t>
       </w:r>
       <w:r>
         <w:rPr>
-          <w:sz w:val="18"/>
+          <w:sz w:val="17"/>
         </w:rPr>
         <w:t>conducting zero-shot evaluations on external public databases (HF_Lung_V1) to quantify the clinical generalization gap across varying diagnostic recording hardware.</w:t>
       </w:r>
     </w:p>
     <w:p>
       <w:pPr>
-        <w:spacing w:after="60"/>
+        <w:spacing w:after="30"/>
       </w:pPr>
       <w:r>
         <w:rPr>
           <w:b/>
-          <w:sz w:val="18"/>
+          <w:sz w:val="17"/>
         </w:rPr>
         <w:t xml:space="preserve">6. Point-of-Care Edge Optimization — </w:t>
       </w:r>
       <w:r>
         <w:rPr>
-          <w:sz w:val="18"/>
+          <w:sz w:val="17"/>
         </w:rPr>
-        <w:t>exporting the pipeline via ONNX Runtime and TorchScript to evaluate latency, memory footprint, and CPU execution limits for digital stethoscope integration.</w:t>
+        <w:t>exporting the pipeline via ONNX Runtime and TorchScript to evaluate latency and memory limits for digital stethoscope integration.</w:t>
       </w:r>
     </w:p>
     <w:p>
       <w:pPr>
-        <w:spacing w:before="120" w:after="320"/>
+        <w:spacing w:before="120" w:after="40"/>
+      </w:pPr>
+      <w:r>
+        <w:rPr>
+          <w:b/>
+          <w:sz w:val="19"/>
+        </w:rPr>
+        <w:t>REAL SYSTEM OUTPUTS &amp; EXPERIMENTAL VALIDATION:</w:t>
+      </w:r>
+    </w:p>
+    <w:p>
+      <w:pPr>
+        <w:spacing w:after="200"/>
         <w:jc w:val="center"/>
       </w:pPr>
       <w:r>
         <w:drawing>
           <wp:inline xmlns:a="http://schemas.openxmlformats.org/drawingml/2006/main" xmlns:pic="http://schemas.openxmlformats.org/drawingml/2006/picture">
-            <wp:extent cx="5486400" cy="3352800"/>
-            <wp:docPr id="2" name="Picture 2"/>
+            <wp:extent cx="5394960" cy="2636387"/>
+            <wp:docPr id="6" name="Picture 6"/>
             <wp:cNvGraphicFramePr>
               <a:graphicFrameLocks noChangeAspect="1"/>
             </wp:cNvGraphicFramePr>
@@ -1156,11 +1242,11 @@
               <a:graphicData uri="http://schemas.openxmlformats.org/drawingml/2006/picture">
                 <pic:pic>
                   <pic:nvPicPr>
-                    <pic:cNvPr id="0" name="next_phase_diagram.png"/>
+                    <pic:cNvPr id="0" name="real_system_outputs.png"/>
                     <pic:cNvPicPr/>
                   </pic:nvPicPr>
                   <pic:blipFill>
-                    <a:blip r:embed="rId10"/>
+                    <a:blip r:embed="rId14"/>
                     <a:stretch>
                       <a:fillRect/>
                     </a:stretch>
@@ -1168,7 +1254,7 @@
                   <pic:spPr>
                     <a:xfrm>
                       <a:off x="0" y="0"/>
-                      <a:ext cx="5486400" cy="3352800"/>
+                      <a:ext cx="5394960" cy="2636387"/>
                     </a:xfrm>
                     <a:prstGeom prst="rect"/>
                   </pic:spPr>
@@ -1181,7 +1267,7 @@
     </w:p>
     <w:p>
       <w:pPr>
-        <w:spacing w:before="500" w:after="40"/>
+        <w:spacing w:before="240" w:after="40"/>
       </w:pPr>
     </w:p>
     <w:tbl>
@@ -1192,8 +1278,8 @@
         <w:tblLook w:firstColumn="1" w:firstRow="1" w:lastColumn="0" w:lastRow="0" w:noHBand="0" w:noVBand="1" w:val="04A0"/>
       </w:tblPr>
       <w:tblGrid>
-        <w:gridCol w:w="5040"/>
-        <w:gridCol w:w="5040"/>
+        <w:gridCol w:w="5112"/>
+        <w:gridCol w:w="5112"/>
       </w:tblGrid>
       <w:tr>
         <w:tc>
@@ -1217,7 +1303,7 @@
             </w:r>
             <w:r>
               <w:rPr>
-                <w:sz w:val="18"/>
+                <w:sz w:val="17"/>
               </w:rPr>
               <w:t>Project Mentor</w:t>
             </w:r>
@@ -1247,7 +1333,7 @@
             </w:r>
             <w:r>
               <w:rPr>
-                <w:sz w:val="18"/>
+                <w:sz w:val="17"/>
               </w:rPr>
               <w:t>Head of Department (CSE-AIML)</w:t>
             </w:r>
@@ -1271,7 +1357,7 @@
     </w:tbl>
     <w:sectPr>
       <w:pgSz w:w="12240" w:h="15840"/>
-      <w:pgMar w:top="1008" w:right="1080" w:bottom="1008" w:left="1080" w:header="720" w:footer="720" w:gutter="0"/>
+      <w:pgMar w:top="864" w:right="1008" w:bottom="864" w:left="1008" w:header="720" w:footer="720" w:gutter="0"/>
       <w:cols w:space="720"/>
       <w:docGrid w:linePitch="360"/>
     </w:sectPr>

</xml_diff>

<commit_message>
update report diagram to 2-panel XAI real outputs
</commit_message>
<xml_diff>
--- a/Micro_Project_Progress_Report_Final.docx
+++ b/Micro_Project_Progress_Report_Final.docx
@@ -1215,14 +1215,14 @@
     </w:p>
     <w:p>
       <w:pPr>
-        <w:spacing w:before="120" w:after="40"/>
+        <w:spacing w:before="160" w:after="40"/>
       </w:pPr>
       <w:r>
         <w:rPr>
           <w:b/>
           <w:sz w:val="19"/>
         </w:rPr>
-        <w:t>REAL SYSTEM OUTPUTS &amp; EXPERIMENTAL VALIDATION:</w:t>
+        <w:t>REAL SYSTEM EXPLAINABILITY OUTPUTS:</w:t>
       </w:r>
     </w:p>
     <w:p>
@@ -1233,7 +1233,7 @@
       <w:r>
         <w:drawing>
           <wp:inline xmlns:a="http://schemas.openxmlformats.org/drawingml/2006/main" xmlns:pic="http://schemas.openxmlformats.org/drawingml/2006/picture">
-            <wp:extent cx="5394960" cy="2636387"/>
+            <wp:extent cx="5669280" cy="3851231"/>
             <wp:docPr id="6" name="Picture 6"/>
             <wp:cNvGraphicFramePr>
               <a:graphicFrameLocks noChangeAspect="1"/>
@@ -1242,7 +1242,7 @@
               <a:graphicData uri="http://schemas.openxmlformats.org/drawingml/2006/picture">
                 <pic:pic>
                   <pic:nvPicPr>
-                    <pic:cNvPr id="0" name="real_system_outputs.png"/>
+                    <pic:cNvPr id="0" name="real_xai_diagram.png"/>
                     <pic:cNvPicPr/>
                   </pic:nvPicPr>
                   <pic:blipFill>
@@ -1254,7 +1254,7 @@
                   <pic:spPr>
                     <a:xfrm>
                       <a:off x="0" y="0"/>
-                      <a:ext cx="5394960" cy="2636387"/>
+                      <a:ext cx="5669280" cy="3851231"/>
                     </a:xfrm>
                     <a:prstGeom prst="rect"/>
                   </pic:spPr>
@@ -1267,7 +1267,7 @@
     </w:p>
     <w:p>
       <w:pPr>
-        <w:spacing w:before="240" w:after="40"/>
+        <w:spacing w:before="280" w:after="40"/>
       </w:pPr>
     </w:p>
     <w:tbl>

</xml_diff>